<commit_message>
Agrega el generador del historial de pipelines y lo regenera
La captura del historial de ejecuciones no tenia el script que la producia,
asi que no se podia reproducir ni actualizar. gen_04_pipelines.sh consulta
la API publica de GitHub y arma la salida que se convierte en PNG con
render_terminal.py.

Se quitaron los emoji del marcador de estado: la fuente monoespaciada del
sistema no tiene glifos de emoji y los dibujaba como caracteres rotos, que
en la imagen anterior aparecian como "%?7ee787". Ahora cada estado se
escribe como success o failure, que ademas es lo que se puede citar en un
documento impreso.

Tambien se ordeno la numeracion del .md: se habia duplicado el bloque de
bases de datos dentro de la seccion de NGINX, quedaban dos secciones 4.4
distintas y los numeros de captura se saltaban.
</commit_message>
<xml_diff>
--- a/Documentos/Laboratorio2_WalletUCP_Camilo.docx
+++ b/Documentos/Laboratorio2_WalletUCP_Camilo.docx
@@ -5335,7 +5335,7 @@
       <w:r>
         <w:drawing>
           <wp:inline distT="0" distB="0" distL="0" distR="0">
-            <wp:extent cx="5943600" cy="8499655"/>
+            <wp:extent cx="5943600" cy="4753928"/>
             <wp:effectExtent l="0" t="0" r="0" b="0"/>
             <wp:docPr id="6" name="image6.png"/>
             <wp:cNvGraphicFramePr>
@@ -5357,7 +5357,7 @@
                   <pic:spPr>
                     <a:xfrm>
                       <a:off x="0" y="0"/>
-                      <a:ext cx="5943600" cy="8499655"/>
+                      <a:ext cx="5943600" cy="4753928"/>
                     </a:xfrm>
                     <a:prstGeom prst="rect">
                       <a:avLst/>

</xml_diff>

<commit_message>
Registra el PR #2 aprobado y actualiza las evidencias
El PR #2 (develop -> main, commit d2267f9) lo aprobo xcandres04 el
30/09/2026 a las 09:01 UTC y se combino un minuto despues sin usar el
bypass. Ese push a main disparo deploy_main y el job version, que creo la
etiqueta v1.0.5 sobre el commit de combinacion. Se documenta el dato
concreto, que es el que demuestra que la regla de proteccion se cumplio.

Se actualizan el historial de commits, las etiquetas (v1.0.0 a v1.0.5) y
las evidencias del repositorio y de los pipelines, que ahora reflejan el
estado real. El .docx se regenera con 15 imagenes incrustadas; quedan
cinco marcadores visibles para las capturas que requieren sesion iniciada
en GitHub.
</commit_message>
<xml_diff>
--- a/Documentos/Laboratorio2_WalletUCP_Camilo.docx
+++ b/Documentos/Laboratorio2_WalletUCP_Camilo.docx
@@ -4429,7 +4429,7 @@
       <w:r>
         <w:drawing>
           <wp:inline distT="0" distB="0" distL="0" distR="0">
-            <wp:extent cx="5943600" cy="6164297"/>
+            <wp:extent cx="5943600" cy="6324112"/>
             <wp:effectExtent l="0" t="0" r="0" b="0"/>
             <wp:docPr id="4" name="image4.png"/>
             <wp:cNvGraphicFramePr>
@@ -4451,7 +4451,7 @@
                   <pic:spPr>
                     <a:xfrm>
                       <a:off x="0" y="0"/>
-                      <a:ext cx="5943600" cy="6164297"/>
+                      <a:ext cx="5943600" cy="6324112"/>
                     </a:xfrm>
                     <a:prstGeom prst="rect">
                       <a:avLst/>
@@ -4476,7 +4476,7 @@
           <w:sz w:val="17"/>
           <w:szCs w:val="17"/>
         </w:rPr>
-        <w:t xml:space="preserve">Figura 4. Ramas del repositorio (develop y main), historial de commits, etiquetas v1.0.0 a v1.0.4, y el remoto en GitHub.</w:t>
+        <w:t xml:space="preserve">Figura 4. Ramas del repositorio (develop y main), historial de commits, etiquetas v1.0.0 a v1.0.5, y el remoto en GitHub.</w:t>
       </w:r>
     </w:p>
     <w:tbl>
@@ -4714,7 +4714,7 @@
         <w:spacing w:after="120" w:before="0"/>
       </w:pPr>
       <w:r>
-        <w:t xml:space="preserve">Como extensión, el pipeline crea una etiqueta vX.Y.Z por cada despliegue a Producción, de manera que cada combinación a main queda asociada a una versión. Al momento de redactar este informe el repositorio tenía las etiquetas v1.0.0 a v1.0.4, visibles en la Figura 4; la numeración crece sola con cada nuevo despliegue. La v1.0.4 la creó automáticamente el job version sobre el commit de combinación del Pull Request, y es la prueba de que ese recorrido de despliegue se ejecutó de principio a fin.</w:t>
+        <w:t xml:space="preserve">Como extensión, el pipeline crea una etiqueta vX.Y.Z por cada despliegue a Producción, de manera que cada combinación a main queda asociada a una versión. Al momento de redactar este informe el repositorio tenía las etiquetas v1.0.0 a v1.0.5, visibles en la Figura 4; la numeración crece sola con cada nuevo despliegue. Las dos últimas las creó automáticamente el job version: la v1.0.4 sobre el commit de combinación del PR #1, y la v1.0.5 sobre el del PR #2. Cada una es la prueba de que ese recorrido de despliegue se ejecutó de principio a fin.</w:t>
       </w:r>
     </w:p>
     <w:p>
@@ -5508,7 +5508,15 @@
         <w:spacing w:after="120" w:before="0"/>
       </w:pPr>
       <w:r>
-        <w:t xml:space="preserve">Nota sobre el primer Pull Request: el PR #1 (develop hacia main) sí llegó a combinarse, pero lo hizo saltándose la regla de aprobación. Mientras se terminaba de poner en marcha el runner autoalojado se marcó la casilla Merge without waiting for requirements to be met, que GitHub solo ofrece al propietario del repositorio. Se puede comprobar en el historial: ese PR figura como Merged con No reviews, y main avanzó igualmente. No se corrigió rebobinando la rama, porque eso habría borrado la etiqueta v1.0.4 y habría obligado a volver a desplegar a Producción. Se deja registrado tal cual, y el flujo completo con aprobación de un segundo revisor se demuestra en el PR #2, que es el que ilustran las dos capturas siguientes.</w:t>
+        <w:t xml:space="preserve">Nota sobre el primer Pull Request: el PR #1 (develop hacia main) sí llegó a combinarse, pero lo hizo saltándose la regla de aprobación. Mientras se terminaba de poner en marcha el runner autoalojado se marcó la casilla Merge without waiting for requirements to be met, que GitHub solo ofrece al propietario del repositorio. Se puede comprobar en el historial: ese PR figura como Merged con No reviews, y main avanzó igualmente. No se corrigió rebobinando la rama, porque eso habría borrado la etiqueta v1.0.4 y habría obligado a volver a desplegar a Producción. Se deja registrado tal cual, y el flujo completo con aprobación de un segundo revisor se demuestra en el PR #2.</w:t>
+      </w:r>
+    </w:p>
+    <w:p>
+      <w:pPr>
+        <w:spacing w:after="120" w:before="0"/>
+      </w:pPr>
+      <w:r>
+        <w:t xml:space="preserve">El PR #2 (develop hacia main, commit d2267f9) sí siguió el flujo completo: xcandres04 lo aprobó el 30 de septiembre de 2026 a las 09:01 UTC y se combinó un minuto después, sin usar el bypass. Ese push a main disparó deploy_main y el job version, que creó la etiqueta v1.0.5.</w:t>
       </w:r>
     </w:p>
     <w:p>

</xml_diff>